<commit_message>
fix: Move email templates from unfiled-public to named SentinelFlow_Emails folder to prevent install conflicts
</commit_message>
<xml_diff>
--- a/SentinelFlow_Documentation.docx
+++ b/SentinelFlow_Documentation.docx
@@ -1,6 +1,6 @@
 
 <file path=word/document.xml><?xml version="1.0" encoding="utf-8"?>
-<w:document xmlns:wpc="http://schemas.microsoft.com/office/word/2010/wordprocessingCanvas" xmlns:mc="http://schemas.openxmlformats.org/markup-compatibility/2006" xmlns:o="urn:schemas-microsoft-com:office:office" xmlns:r="http://schemas.openxmlformats.org/officeDocument/2006/relationships" xmlns:m="http://schemas.openxmlformats.org/officeDocument/2006/math" xmlns:v="urn:schemas-microsoft-com:vml" xmlns:wp14="http://schemas.microsoft.com/office/word/2010/wordprocessingDrawing" xmlns:wp="http://schemas.openxmlformats.org/drawingml/2006/wordprocessingDrawing" xmlns:w10="urn:schemas-microsoft-com:office:word" xmlns:w="http://schemas.openxmlformats.org/wordprocessingml/2006/main" xmlns:w14="http://schemas.microsoft.com/office/word/2010/wordml" xmlns:wpg="http://schemas.microsoft.com/office/word/2010/wordprocessingGroup" xmlns:wpi="http://schemas.microsoft.com/office/word/2010/wordprocessingInk" xmlns:wne="http://schemas.microsoft.com/office/word/2006/wordml" xmlns:wps="http://schemas.microsoft.com/office/word/2010/wordprocessingShape" mc:Ignorable="w14 wp14">
+<w:document xmlns:ns1="http://schemas.openxmlformats.org/markup-compatibility/2006" xmlns:w="http://schemas.openxmlformats.org/wordprocessingml/2006/main" ns1:Ignorable="w14 wp14">
   <w:body>
     <w:p>
       <w:r>
@@ -1170,6 +1170,459 @@
       </w:r>
     </w:p>
     <w:p/>
+    <w:p>
+      <w:pPr>
+        <w:pStyle w:val="Heading1"/>
+      </w:pPr>
+      <w:r>
+        <w:t>SentinelFlow MVP v0.10 Release Snapshot</w:t>
+      </w:r>
+    </w:p>
+    <w:p>
+      <w:r>
+        <w:t/>
+      </w:r>
+    </w:p>
+    <w:p>
+      <w:pPr>
+        <w:pStyle w:val="Heading2"/>
+      </w:pPr>
+      <w:r>
+        <w:t>1. Current MVP Version</w:t>
+      </w:r>
+    </w:p>
+    <w:p>
+      <w:r>
+        <w:t>Release Name: SentinelFlow MVP v0.10</w:t>
+      </w:r>
+    </w:p>
+    <w:p>
+      <w:r>
+        <w:t>SentinelFlow MVP v0.10 is a Salesforce-native AI incident intelligence system powered by Zentom AI. It detects incidents, calculates risk, applies policy, generates recommendations, maps runbooks, captures human approval, executes safe Case creation, records replay timelines, and displays Org Health Score in the SentinelFlow dashboard.</w:t>
+      </w:r>
+    </w:p>
+    <w:p>
+      <w:r>
+        <w:t/>
+      </w:r>
+    </w:p>
+    <w:p>
+      <w:pPr>
+        <w:pStyle w:val="Heading2"/>
+      </w:pPr>
+      <w:r>
+        <w:t>2. Completed Milestones</w:t>
+      </w:r>
+    </w:p>
+    <w:p>
+      <w:r>
+        <w:t>Milestone 1 — Zentom API + Risk + Policy</w:t>
+      </w:r>
+    </w:p>
+    <w:p>
+      <w:r>
+        <w:t>Milestone 2 — Salesforce to Zentom API connection</w:t>
+      </w:r>
+    </w:p>
+    <w:p>
+      <w:r>
+        <w:t>Milestone 3 — Salesforce write-back + SentinelFlow Lightning app</w:t>
+      </w:r>
+    </w:p>
+    <w:p>
+      <w:r>
+        <w:t>Milestone 4 — AI Recommendation Engine</w:t>
+      </w:r>
+    </w:p>
+    <w:p>
+      <w:r>
+        <w:t>Milestone 5 — Human Approval</w:t>
+      </w:r>
+    </w:p>
+    <w:p>
+      <w:r>
+        <w:t>Milestone 6 — Safe Execution / Case Creation</w:t>
+      </w:r>
+    </w:p>
+    <w:p>
+      <w:r>
+        <w:t>Milestone 7 — Runbook Engine</w:t>
+      </w:r>
+    </w:p>
+    <w:p>
+      <w:r>
+        <w:t>Milestone 8 — Dashboard V1</w:t>
+      </w:r>
+    </w:p>
+    <w:p>
+      <w:r>
+        <w:t>Milestone 8B — Clean MVP deployment stabilization</w:t>
+      </w:r>
+    </w:p>
+    <w:p>
+      <w:r>
+        <w:t>Milestone 9 — Replay Timeline</w:t>
+      </w:r>
+    </w:p>
+    <w:p>
+      <w:r>
+        <w:t>Milestone 10 — Org Health Score</w:t>
+      </w:r>
+    </w:p>
+    <w:p>
+      <w:r>
+        <w:t/>
+      </w:r>
+    </w:p>
+    <w:p>
+      <w:pPr>
+        <w:pStyle w:val="Heading2"/>
+      </w:pPr>
+      <w:r>
+        <w:t>3. Current Architecture</w:t>
+      </w:r>
+    </w:p>
+    <w:p>
+      <w:r>
+        <w:t>Salesforce-native SentinelFlow Lightning app provides the admin command center and incident record experience.</w:t>
+      </w:r>
+    </w:p>
+    <w:p>
+      <w:r>
+        <w:t>Apex controllers orchestrate incident ingestion, approval, execution, replay, and dashboard intelligence.</w:t>
+      </w:r>
+    </w:p>
+    <w:p>
+      <w:r>
+        <w:t>Custom objects store incidents, audit logs, policy decisions, created Case references, and replay timeline data.</w:t>
+      </w:r>
+    </w:p>
+    <w:p>
+      <w:r>
+        <w:t>Custom metadata stores Zentom settings and runbook definitions for MVP-safe configuration.</w:t>
+      </w:r>
+    </w:p>
+    <w:p>
+      <w:r>
+        <w:t>Zentom AI backend services provide incident intake, risk and policy evaluation, recommendation generation, and runbook mapping.</w:t>
+      </w:r>
+    </w:p>
+    <w:p>
+      <w:r>
+        <w:t>A clean MVP manifest isolates stable metadata from legacy and experimental modules.</w:t>
+      </w:r>
+    </w:p>
+    <w:p>
+      <w:r>
+        <w:t/>
+      </w:r>
+    </w:p>
+    <w:p>
+      <w:pPr>
+        <w:pStyle w:val="Heading2"/>
+      </w:pPr>
+      <w:r>
+        <w:t>4. Salesforce Components</w:t>
+      </w:r>
+    </w:p>
+    <w:p>
+      <w:r>
+        <w:t>Apex: ZentomIncidentClient, ZentomApprovalController, ZentomExecutionController, ZentomRunbookService, ZentomReplayController, ZentomDashboardController, and related tests.</w:t>
+      </w:r>
+    </w:p>
+    <w:p>
+      <w:r>
+        <w:t>LWC: zentomApprovalPanel, zentomReplayTimeline, and zentomDashboard.</w:t>
+      </w:r>
+    </w:p>
+    <w:p>
+      <w:r>
+        <w:t>Objects: Sentinel_Incident__c, Sentinel_Audit_Log__c, Zentom_Policy_Decision__c, Zentom_Setting__mdt, and Zentom_Runbook__mdt.</w:t>
+      </w:r>
+    </w:p>
+    <w:p>
+      <w:r>
+        <w:t>Pages: SentinelFlow Home dashboard and Sentinel Incident record page.</w:t>
+      </w:r>
+    </w:p>
+    <w:p>
+      <w:r>
+        <w:t>App metadata: SentinelFlow Lightning app, custom tabs, layouts, list views, permission set, custom metadata records, and Zentom API remote site setting.</w:t>
+      </w:r>
+    </w:p>
+    <w:p>
+      <w:r>
+        <w:t/>
+      </w:r>
+    </w:p>
+    <w:p>
+      <w:pPr>
+        <w:pStyle w:val="Heading2"/>
+      </w:pPr>
+      <w:r>
+        <w:t>5. Backend Components</w:t>
+      </w:r>
+    </w:p>
+    <w:p>
+      <w:r>
+        <w:t>Zentom API receives Salesforce incident payloads and returns risk, policy, recommendation, and runbook results.</w:t>
+      </w:r>
+    </w:p>
+    <w:p>
+      <w:r>
+        <w:t>Risk and policy engine applies deterministic MVP rules before recommendations are surfaced in Salesforce.</w:t>
+      </w:r>
+    </w:p>
+    <w:p>
+      <w:r>
+        <w:t>AI recommendation engine is currently rule-based and prepared for real LLM integration in a later milestone.</w:t>
+      </w:r>
+    </w:p>
+    <w:p>
+      <w:r>
+        <w:t>Runbook engine maps incident types to safe recovery playbooks.</w:t>
+      </w:r>
+    </w:p>
+    <w:p>
+      <w:r>
+        <w:t>Replay timeline is persisted through Sentinel audit logs for trust and review.</w:t>
+      </w:r>
+    </w:p>
+    <w:p>
+      <w:r>
+        <w:t>Local MVP backend currently uses SQLite storage.</w:t>
+      </w:r>
+    </w:p>
+    <w:p>
+      <w:r>
+        <w:t/>
+      </w:r>
+    </w:p>
+    <w:p>
+      <w:pPr>
+        <w:pStyle w:val="Heading2"/>
+      </w:pPr>
+      <w:r>
+        <w:t>6. Dashboard + Org Health Score</w:t>
+      </w:r>
+    </w:p>
+    <w:p>
+      <w:r>
+        <w:t>SentinelFlow dashboard displays Total Incidents, Critical Incidents, Pending Approvals, Executed Actions, Rejected Recommendations, Recent Replay Events, Top Runbook, and Recent Cases Created.</w:t>
+      </w:r>
+    </w:p>
+    <w:p>
+      <w:r>
+        <w:t>Dashboard tables show Recent Incidents, Pending Approvals, Recent Executions, Replay Events, and Case references created by safe execution.</w:t>
+      </w:r>
+    </w:p>
+    <w:p>
+      <w:r>
+        <w:t>Zentom Org Health Score gives admins and managers a 0-100 executive health signal calculated from real Sentinel_Incident__c data.</w:t>
+      </w:r>
+    </w:p>
+    <w:p>
+      <w:r>
+        <w:t>Org Health Score = 100</w:t>
+      </w:r>
+    </w:p>
+    <w:p>
+      <w:r>
+        <w:t>- Critical Open Incidents × 10</w:t>
+      </w:r>
+    </w:p>
+    <w:p>
+      <w:r>
+        <w:t>- Pending Approvals × 8</w:t>
+      </w:r>
+    </w:p>
+    <w:p>
+      <w:r>
+        <w:t>- Failed Executions × 12</w:t>
+      </w:r>
+    </w:p>
+    <w:p>
+      <w:r>
+        <w:t>- Rejected Recommendations × 5</w:t>
+      </w:r>
+    </w:p>
+    <w:p>
+      <w:r>
+        <w:t>- Open High Risk Incidents × 6</w:t>
+      </w:r>
+    </w:p>
+    <w:p>
+      <w:r>
+        <w:t>Status mapping:</w:t>
+      </w:r>
+    </w:p>
+    <w:p>
+      <w:r>
+        <w:t>90–100 = Healthy</w:t>
+      </w:r>
+    </w:p>
+    <w:p>
+      <w:r>
+        <w:t>70–89 = Stable</w:t>
+      </w:r>
+    </w:p>
+    <w:p>
+      <w:r>
+        <w:t>50–69 = At Risk</w:t>
+      </w:r>
+    </w:p>
+    <w:p>
+      <w:r>
+        <w:t>0–49 = Critical</w:t>
+      </w:r>
+    </w:p>
+    <w:p>
+      <w:r>
+        <w:t/>
+      </w:r>
+    </w:p>
+    <w:p>
+      <w:pPr>
+        <w:pStyle w:val="Heading2"/>
+      </w:pPr>
+      <w:r>
+        <w:t>7. Current Test Status</w:t>
+      </w:r>
+    </w:p>
+    <w:p>
+      <w:r>
+        <w:t>Milestone 10 validation passed with 14 tests passing and 0 failing.</w:t>
+      </w:r>
+    </w:p>
+    <w:p>
+      <w:r>
+        <w:t>Milestone 10 deployment passed with 14 tests passing and 0 failing.</w:t>
+      </w:r>
+    </w:p>
+    <w:p>
+      <w:r>
+        <w:t>Clean MVP manifest validation is passing.</w:t>
+      </w:r>
+    </w:p>
+    <w:p>
+      <w:r>
+        <w:t>Test scope includes ZentomIncidentClientTest, ZentomApprovalControllerTest, ZentomExecutionControllerTest, ZentomReplayControllerTest, and ZentomDashboardControllerTest.</w:t>
+      </w:r>
+    </w:p>
+    <w:p>
+      <w:r>
+        <w:t/>
+      </w:r>
+    </w:p>
+    <w:p>
+      <w:pPr>
+        <w:pStyle w:val="Heading2"/>
+      </w:pPr>
+      <w:r>
+        <w:t>8. Deployment Notes</w:t>
+      </w:r>
+    </w:p>
+    <w:p>
+      <w:r>
+        <w:t>MVP deployment uses manifest/package-mvp.xml to deploy only stable SentinelFlow metadata.</w:t>
+      </w:r>
+    </w:p>
+    <w:p>
+      <w:r>
+        <w:t>Validated and deployed to the AstroSoft Salesforce org using the Salesforce CLI.</w:t>
+      </w:r>
+    </w:p>
+    <w:p>
+      <w:r>
+        <w:t>Use repeated --tests flags for this installed sf CLI, because the comma-separated test list can result in zero tests being executed.</w:t>
+      </w:r>
+    </w:p>
+    <w:p>
+      <w:r>
+        <w:t>Legacy and experimental metadata is intentionally excluded from the MVP deployment path.</w:t>
+      </w:r>
+    </w:p>
+    <w:p>
+      <w:r>
+        <w:t>SentinelFlow app opens to the SentinelFlow Home dashboard, and Sentinel Incident records open with approval panel plus replay timeline.</w:t>
+      </w:r>
+    </w:p>
+    <w:p>
+      <w:r>
+        <w:t/>
+      </w:r>
+    </w:p>
+    <w:p>
+      <w:pPr>
+        <w:pStyle w:val="Heading2"/>
+      </w:pPr>
+      <w:r>
+        <w:t>9. Known Limitations</w:t>
+      </w:r>
+    </w:p>
+    <w:p>
+      <w:r>
+        <w:t>1. Zentom API currently uses SQLite for local MVP.</w:t>
+      </w:r>
+    </w:p>
+    <w:p>
+      <w:r>
+        <w:t>2. Cloudflare quick tunnel URL is temporary.</w:t>
+      </w:r>
+    </w:p>
+    <w:p>
+      <w:r>
+        <w:t>3. AI recommendation is rule-based, not real LLM yet.</w:t>
+      </w:r>
+    </w:p>
+    <w:p>
+      <w:r>
+        <w:t>4. Case Origin still falls back to Web unless SentinelFlow value is added.</w:t>
+      </w:r>
+    </w:p>
+    <w:p>
+      <w:r>
+        <w:t>5. Legacy/experimental metadata is excluded from MVP manifest.</w:t>
+      </w:r>
+    </w:p>
+    <w:p>
+      <w:r>
+        <w:t>6. Auto-healing is not enabled beyond safe Case creation.</w:t>
+      </w:r>
+    </w:p>
+    <w:p>
+      <w:r>
+        <w:t/>
+      </w:r>
+    </w:p>
+    <w:p>
+      <w:pPr>
+        <w:pStyle w:val="Heading2"/>
+      </w:pPr>
+      <w:r>
+        <w:t>10. Next Roadmap</w:t>
+      </w:r>
+    </w:p>
+    <w:p>
+      <w:r>
+        <w:t>Milestone 11 — Real LLM Integration</w:t>
+      </w:r>
+    </w:p>
+    <w:p>
+      <w:r>
+        <w:t>Milestone 12 — PostgreSQL migration</w:t>
+      </w:r>
+    </w:p>
+    <w:p>
+      <w:r>
+        <w:t>Milestone 13 — Packaging readiness and cleanup</w:t>
+      </w:r>
+    </w:p>
+    <w:p>
+      <w:r>
+        <w:t>Future V2 opportunities: prediction engine, org stability score, deployment risk score, automation health score, and Salesforce admin health score.</w:t>
+      </w:r>
+    </w:p>
     <w:sectPr>
       <w:pgSz w:w="12240" w:h="15840"/>
       <w:pgMar w:top="1440" w:right="1440" w:bottom="1440" w:left="1440" w:header="708" w:footer="708" w:gutter="0"/>

</xml_diff>